<commit_message>
atualiza briefing com manchetes reais e links nos cursos de notícia
Adiciona manchetes reais e hyperlinks para os 5 cursos com
referência de "Notícia" no briefing: PGDT (IBS exportação indireta),
PGDL (dosimetria), PGDDDIA (Marco Regulatório da IA), MBADS
(tendências de IA), PGDTRA (audiência pública STF sobre plataformas)
e MBADRSE (leilão de transmissão ANEEL 1/2026).

PGMEC permanece com placeholder — sigla não identificada nos cursos
do IDP; precisa de confirmação para escolher manchete adequada.

Cada curso com notícia ganha duas linhas adicionais: a manchete-base
com link clicável e a copy sugerida no formato "[Manchete]. Sua Turma
de Alto Nível 2026 estuda isso na semana 1."
</commit_message>
<xml_diff>
--- a/Briefing - Matriculas Abertas 2026.docx
+++ b/Briefing - Matriculas Abertas 2026.docx
@@ -79,17 +79,17 @@
     </w:p>
     <w:p>
       <w:r>
-        <w:t>• Headline-tipo Onda 1 (Convite): "A Turma de Alto Nível 2026 — [curso] — está aberta."</w:t>
+        <w:t>• Onda 1 (Convite): "A Turma de Alto Nível 2026 — [curso] — está aberta."</w:t>
         <w:br/>
-        <w:t>• Headline-tipo Onda 2 (Curadoria): "O Alto Nível começa na seleção. Turma selecionada por análise curricular."</w:t>
+        <w:t>• Onda 2 (Curadoria): "O Alto Nível começa na seleção. Turma selecionada por análise curricular."</w:t>
         <w:br/>
-        <w:t>• Headline-tipo Onda 2 (Corpo docente): "Alto Nível em sala. Alto Nível em quadro."</w:t>
+        <w:t>• Onda 2 (Corpo docente): "Alto Nível em sala. Alto Nível em quadro."</w:t>
         <w:br/>
-        <w:t>• Headline-tipo Onda 3 (Calendário/Notícia): "[Manchete da área]. Sua Turma 2026 estuda isso na semana 1."</w:t>
+        <w:t>• Onda 3 (Notícia): "[Manchete real]. Sua Turma 2026 estuda isso na semana 1."</w:t>
         <w:br/>
         <w:t>• Substituir "Inscrições abertas" por "Matrículas abertas para a Turma 2026".</w:t>
         <w:br/>
-        <w:t>• Não usar argumento de condição de pagamento. Substituir benefícios monetários por "Matrícula antecipada: escolha de orientador e prioridade nas eletivas".</w:t>
+        <w:t>• Sem argumento de condição de pagamento. Trocar por: "Matrícula antecipada: escolha de orientador e prioridade nas eletivas".</w:t>
       </w:r>
     </w:p>
     <w:p>
@@ -139,7 +139,44 @@
     </w:p>
     <w:p>
       <w:r>
-        <w:t>14.05.26 - PGDT - Fundo - Estatico - Noticia - Manchete Tributaria Turma 2026</w:t>
+        <w:t>14.05.26 - PGDT - Fundo - Estatico - Noticia - IBS Exportacao Indireta - Conjur 13.05.26</w:t>
+      </w:r>
+    </w:p>
+    <w:p>
+      <w:r>
+        <w:rPr>
+          <w:b/>
+        </w:rPr>
+        <w:t xml:space="preserve">Manchete-base para a peça de notícia: </w:t>
+      </w:r>
+      <w:r>
+        <w:t xml:space="preserve">“Juiz do DF livra empresas de IBS sobre exportação indireta” </w:t>
+      </w:r>
+      <w:r>
+        <w:t>(</w:t>
+      </w:r>
+      <w:hyperlink r:id="rId9">
+        <w:r>
+          <w:rPr>
+            <w:color w:val="0563C1"/>
+            <w:u w:val="single"/>
+          </w:rPr>
+          <w:t xml:space="preserve">ler matéria</w:t>
+        </w:r>
+      </w:hyperlink>
+      <w:r>
+        <w:t>)</w:t>
+      </w:r>
+    </w:p>
+    <w:p>
+      <w:r>
+        <w:rPr>
+          <w:i/>
+        </w:rPr>
+        <w:t xml:space="preserve">Copy sugerida: </w:t>
+      </w:r>
+      <w:r>
+        <w:t>“Juiz do DF livra empresas de IBS sobre exportação indireta. Sua Turma de Alto Nível 2026 estuda isso na semana 1.”</w:t>
       </w:r>
     </w:p>
     <w:p>
@@ -294,7 +331,44 @@
     </w:p>
     <w:p>
       <w:r>
-        <w:t>14.05.26 - PGDL - Fundo - Estatico - Noticia - Manchete Legislativa Turma 2026</w:t>
+        <w:t>14.05.26 - PGDL - Fundo - Estatico - Noticia - Congresso Derruba Veto Dosimetria - Migalhas 05.26</w:t>
+      </w:r>
+    </w:p>
+    <w:p>
+      <w:r>
+        <w:rPr>
+          <w:b/>
+        </w:rPr>
+        <w:t xml:space="preserve">Manchete-base para a peça de notícia: </w:t>
+      </w:r>
+      <w:r>
+        <w:t xml:space="preserve">“Congresso derruba veto de Lula ao PL da dosimetria” </w:t>
+      </w:r>
+      <w:r>
+        <w:t>(</w:t>
+      </w:r>
+      <w:hyperlink r:id="rId10">
+        <w:r>
+          <w:rPr>
+            <w:color w:val="0563C1"/>
+            <w:u w:val="single"/>
+          </w:rPr>
+          <w:t xml:space="preserve">ler matéria</w:t>
+        </w:r>
+      </w:hyperlink>
+      <w:r>
+        <w:t>)</w:t>
+      </w:r>
+    </w:p>
+    <w:p>
+      <w:r>
+        <w:rPr>
+          <w:i/>
+        </w:rPr>
+        <w:t xml:space="preserve">Copy sugerida: </w:t>
+      </w:r>
+      <w:r>
+        <w:t>“Congresso derruba veto de Lula ao PL da dosimetria. Sua Turma de Alto Nível 2026 estuda isso na semana 1.”</w:t>
       </w:r>
     </w:p>
     <w:p>
@@ -539,12 +613,49 @@
     </w:p>
     <w:p>
       <w:r>
-        <w:t>14.05.26 - PGDDDIA - Fundo - Estatico - Noticia - Regulacao IA Turma 2026</w:t>
+        <w:t>14.05.26 - PGDDDIA - Fundo - Estatico - Noticia - Marco Regulatorio IA na CCom - Camara 18.03.26</w:t>
       </w:r>
     </w:p>
     <w:p>
       <w:r>
         <w:t>14.05.26 - PGDDDIA - Fundo - Estatico - Foto IDP - Turma 2026 Aberta</w:t>
+      </w:r>
+    </w:p>
+    <w:p>
+      <w:r>
+        <w:rPr>
+          <w:b/>
+        </w:rPr>
+        <w:t xml:space="preserve">Manchete-base para a peça de notícia: </w:t>
+      </w:r>
+      <w:r>
+        <w:t xml:space="preserve">“Comissão aprova criação do Marco Regulatório da Inteligência Artificial no Brasil” </w:t>
+      </w:r>
+      <w:r>
+        <w:t>(</w:t>
+      </w:r>
+      <w:hyperlink r:id="rId11">
+        <w:r>
+          <w:rPr>
+            <w:color w:val="0563C1"/>
+            <w:u w:val="single"/>
+          </w:rPr>
+          <w:t xml:space="preserve">ler matéria</w:t>
+        </w:r>
+      </w:hyperlink>
+      <w:r>
+        <w:t>)</w:t>
+      </w:r>
+    </w:p>
+    <w:p>
+      <w:r>
+        <w:rPr>
+          <w:i/>
+        </w:rPr>
+        <w:t xml:space="preserve">Copy sugerida: </w:t>
+      </w:r>
+      <w:r>
+        <w:t>“Comissão aprova criação do Marco Regulatório da Inteligência Artificial no Brasil. Sua Turma de Alto Nível 2026 estuda isso na semana 1.”</w:t>
       </w:r>
     </w:p>
     <w:p>
@@ -639,12 +750,49 @@
     </w:p>
     <w:p>
       <w:r>
-        <w:t>14.05.26 - MBADS - Fundo - Estatico - Noticia - IA Mercado Turma 2026</w:t>
+        <w:t>14.05.26 - MBADS - Fundo - Estatico - Noticia - Tendencias IA 2026 Financas e Produtividade - Kdea 360</w:t>
       </w:r>
     </w:p>
     <w:p>
       <w:r>
         <w:t>14.05.26 - MBADS - Fundo - Estatico - Foto IDP - Turma 2026 Aberta</w:t>
+      </w:r>
+    </w:p>
+    <w:p>
+      <w:r>
+        <w:rPr>
+          <w:b/>
+        </w:rPr>
+        <w:t xml:space="preserve">Manchete-base para a peça de notícia: </w:t>
+      </w:r>
+      <w:r>
+        <w:t xml:space="preserve">“Tendências de IA até 2026: Brasil avança em finanças, regulação e produtividade assistida” </w:t>
+      </w:r>
+      <w:r>
+        <w:t>(</w:t>
+      </w:r>
+      <w:hyperlink r:id="rId12">
+        <w:r>
+          <w:rPr>
+            <w:color w:val="0563C1"/>
+            <w:u w:val="single"/>
+          </w:rPr>
+          <w:t xml:space="preserve">ler matéria</w:t>
+        </w:r>
+      </w:hyperlink>
+      <w:r>
+        <w:t>)</w:t>
+      </w:r>
+    </w:p>
+    <w:p>
+      <w:r>
+        <w:rPr>
+          <w:i/>
+        </w:rPr>
+        <w:t xml:space="preserve">Copy sugerida: </w:t>
+      </w:r>
+      <w:r>
+        <w:t>“Tendências de IA até 2026: Brasil avança em finanças, regulação e produtividade assistida. Sua Turma de Alto Nível 2026 estuda isso na semana 1.”</w:t>
       </w:r>
     </w:p>
     <w:p>
@@ -789,12 +937,49 @@
     </w:p>
     <w:p>
       <w:r>
-        <w:t>14.05.26 - PGDTRA - Fundo - Estatico - Noticia - Migalhas Turma 2026</w:t>
+        <w:t>14.05.26 - PGDTRA - Fundo - Estatico - Noticia - STF Audiencia Vinculo Plataformas Digitais - STF</w:t>
       </w:r>
     </w:p>
     <w:p>
       <w:r>
         <w:t>14.05.26 - PGDTRA - Fundo - Estatico - Foto IDP - Turma 2026 Aberta</w:t>
+      </w:r>
+    </w:p>
+    <w:p>
+      <w:r>
+        <w:rPr>
+          <w:b/>
+        </w:rPr>
+        <w:t xml:space="preserve">Manchete-base para a peça de notícia: </w:t>
+      </w:r>
+      <w:r>
+        <w:t xml:space="preserve">“STF encerra audiência pública sobre vínculo empregatício em plataformas digitais” </w:t>
+      </w:r>
+      <w:r>
+        <w:t>(</w:t>
+      </w:r>
+      <w:hyperlink r:id="rId13">
+        <w:r>
+          <w:rPr>
+            <w:color w:val="0563C1"/>
+            <w:u w:val="single"/>
+          </w:rPr>
+          <w:t xml:space="preserve">ler matéria</w:t>
+        </w:r>
+      </w:hyperlink>
+      <w:r>
+        <w:t>)</w:t>
+      </w:r>
+    </w:p>
+    <w:p>
+      <w:r>
+        <w:rPr>
+          <w:i/>
+        </w:rPr>
+        <w:t xml:space="preserve">Copy sugerida: </w:t>
+      </w:r>
+      <w:r>
+        <w:t>“STF encerra audiência pública sobre vínculo empregatício em plataformas digitais. Sua Turma de Alto Nível 2026 estuda isso na semana 1.”</w:t>
       </w:r>
     </w:p>
     <w:p>
@@ -954,12 +1139,49 @@
     </w:p>
     <w:p>
       <w:r>
-        <w:t>14.05.26 - MBADRSE - Fundo - Estatico - Noticia - Setor Eletrico Turma 2026</w:t>
+        <w:t>14.05.26 - MBADRSE - Fundo - Estatico - Noticia - ANEEL Homologa Leilao Transmissao 1.2026 - Cenario Energia 13.05.26</w:t>
       </w:r>
     </w:p>
     <w:p>
       <w:r>
         <w:t>14.05.26 - MBADRSE - Fundo - Estatico - Foto IDP - Turma 2026 Aberta</w:t>
+      </w:r>
+    </w:p>
+    <w:p>
+      <w:r>
+        <w:rPr>
+          <w:b/>
+        </w:rPr>
+        <w:t xml:space="preserve">Manchete-base para a peça de notícia: </w:t>
+      </w:r>
+      <w:r>
+        <w:t xml:space="preserve">“ANEEL homologa lotes do Leilão de Transmissão 1/2026 com investimentos de R$ 3,3 bilhões” </w:t>
+      </w:r>
+      <w:r>
+        <w:t>(</w:t>
+      </w:r>
+      <w:hyperlink r:id="rId14">
+        <w:r>
+          <w:rPr>
+            <w:color w:val="0563C1"/>
+            <w:u w:val="single"/>
+          </w:rPr>
+          <w:t xml:space="preserve">ler matéria</w:t>
+        </w:r>
+      </w:hyperlink>
+      <w:r>
+        <w:t>)</w:t>
+      </w:r>
+    </w:p>
+    <w:p>
+      <w:r>
+        <w:rPr>
+          <w:i/>
+        </w:rPr>
+        <w:t xml:space="preserve">Copy sugerida: </w:t>
+      </w:r>
+      <w:r>
+        <w:t>“ANEEL homologa lotes do Leilão de Transmissão 1/2026 com investimentos de R$ 3,3 bilhões. Sua Turma de Alto Nível 2026 estuda isso na semana 1.”</w:t>
       </w:r>
     </w:p>
     <w:p>
@@ -1119,7 +1341,7 @@
     </w:p>
     <w:p>
       <w:r>
-        <w:t>14.05.26 - PGMEC - Fundo - Estatico - Noticia - Manchete Turma 2026</w:t>
+        <w:t>14.05.26 - PGMEC - Fundo - Estatico - Noticia - [sigla nao identificada - manchete a definir apos confirmar curso]</w:t>
       </w:r>
     </w:p>
     <w:p>

</xml_diff>

<commit_message>
completa briefing com manchete do PGMEC (Comunicação Política e Marketing Eleitoral)
PGMEC confirmado como Pós-Graduação em Comunicação Política e
Marketing Eleitoral. Manchete escolhida: "IA nas campanhas
eleitorais 2026: veja o que TSE autoriza ou proíbe" (Migalhas),
combinando ano eleitoral, regulamentação nova do TSE e o tema mais
quente do mercado de campanha em 2026.
</commit_message>
<xml_diff>
--- a/Briefing - Matriculas Abertas 2026.docx
+++ b/Briefing - Matriculas Abertas 2026.docx
@@ -1341,12 +1341,49 @@
     </w:p>
     <w:p>
       <w:r>
-        <w:t>14.05.26 - PGMEC - Fundo - Estatico - Noticia - [sigla nao identificada - manchete a definir apos confirmar curso]</w:t>
+        <w:t>14.05.26 - PGMEC - Fundo - Estatico - Noticia - IA nas Campanhas 2026 - TSE Autoriza ou Proibe - Migalhas</w:t>
       </w:r>
     </w:p>
     <w:p>
       <w:r>
         <w:t>14.05.26 - PGMEC - Fundo - Estatico - Foto IDP - Turma 2026 Aberta</w:t>
+      </w:r>
+    </w:p>
+    <w:p>
+      <w:r>
+        <w:rPr>
+          <w:b/>
+        </w:rPr>
+        <w:t xml:space="preserve">Manchete-base para a peça de notícia: </w:t>
+      </w:r>
+      <w:r>
+        <w:t xml:space="preserve">“IA nas campanhas eleitorais 2026: veja o que TSE autoriza ou proíbe” </w:t>
+      </w:r>
+      <w:r>
+        <w:t>(</w:t>
+      </w:r>
+      <w:hyperlink r:id="rId15">
+        <w:r>
+          <w:rPr>
+            <w:color w:val="0563C1"/>
+            <w:u w:val="single"/>
+          </w:rPr>
+          <w:t xml:space="preserve">ler matéria</w:t>
+        </w:r>
+      </w:hyperlink>
+      <w:r>
+        <w:t>)</w:t>
+      </w:r>
+    </w:p>
+    <w:p>
+      <w:r>
+        <w:rPr>
+          <w:i/>
+        </w:rPr>
+        <w:t xml:space="preserve">Copy sugerida: </w:t>
+      </w:r>
+      <w:r>
+        <w:t>“IA nas campanhas eleitorais 2026: veja o que TSE autoriza ou proíbe. Sua Turma de Alto Nível 2026 estuda isso na semana 1.”</w:t>
       </w:r>
     </w:p>
     <w:sectPr>

</xml_diff>

<commit_message>
ajusta copy dos cursos com notícia para não repetir a manchete
A manchete já é estampada visualmente na peça (modelo Migalhas).
A copy abaixo passa a ser o "gancho do curso" — sintetiza o tema
que aquele curso ensina, conectando à manchete sem reproduzi-la.

Exemplo PGDT:
- Antes: "Juiz do DF livra empresas de IBS sobre exportação indireta.
  Sua Turma 2026 estuda isso na semana 1."
- Agora: "Entenda tudo sobre o IBS e a Reforma Tributária na Turma de
  Alto Nível 2026 do PGDT."

Aplicado aos 7 cursos com referência de notícia (PGDT, PGDL, PGDDDIA,
MBADS, PGDTRA, MBADRSE, PGMEC).
</commit_message>
<xml_diff>
--- a/Briefing - Matriculas Abertas 2026.docx
+++ b/Briefing - Matriculas Abertas 2026.docx
@@ -147,7 +147,7 @@
         <w:rPr>
           <w:b/>
         </w:rPr>
-        <w:t xml:space="preserve">Manchete-base para a peça de notícia: </w:t>
+        <w:t xml:space="preserve">Manchete a estampar na peça (screenshot/citação): </w:t>
       </w:r>
       <w:r>
         <w:t xml:space="preserve">“Juiz do DF livra empresas de IBS sobre exportação indireta” </w:t>
@@ -173,10 +173,10 @@
         <w:rPr>
           <w:i/>
         </w:rPr>
-        <w:t xml:space="preserve">Copy sugerida: </w:t>
+        <w:t xml:space="preserve">Copy sugerida (gancho do curso, não repete a manchete): </w:t>
       </w:r>
       <w:r>
-        <w:t>“Juiz do DF livra empresas de IBS sobre exportação indireta. Sua Turma de Alto Nível 2026 estuda isso na semana 1.”</w:t>
+        <w:t>“Entenda tudo sobre o IBS e a Reforma Tributária na Turma de Alto Nível 2026 do PGDT.”</w:t>
       </w:r>
     </w:p>
     <w:p>
@@ -339,7 +339,7 @@
         <w:rPr>
           <w:b/>
         </w:rPr>
-        <w:t xml:space="preserve">Manchete-base para a peça de notícia: </w:t>
+        <w:t xml:space="preserve">Manchete a estampar na peça (screenshot/citação): </w:t>
       </w:r>
       <w:r>
         <w:t xml:space="preserve">“Congresso derruba veto de Lula ao PL da dosimetria” </w:t>
@@ -365,10 +365,10 @@
         <w:rPr>
           <w:i/>
         </w:rPr>
-        <w:t xml:space="preserve">Copy sugerida: </w:t>
+        <w:t xml:space="preserve">Copy sugerida (gancho do curso, não repete a manchete): </w:t>
       </w:r>
       <w:r>
-        <w:t>“Congresso derruba veto de Lula ao PL da dosimetria. Sua Turma de Alto Nível 2026 estuda isso na semana 1.”</w:t>
+        <w:t>“Domine o processo legislativo brasileiro — do veto à promulgação — na Turma de Alto Nível 2026 do PGDL.”</w:t>
       </w:r>
     </w:p>
     <w:p>
@@ -626,7 +626,7 @@
         <w:rPr>
           <w:b/>
         </w:rPr>
-        <w:t xml:space="preserve">Manchete-base para a peça de notícia: </w:t>
+        <w:t xml:space="preserve">Manchete a estampar na peça (screenshot/citação): </w:t>
       </w:r>
       <w:r>
         <w:t xml:space="preserve">“Comissão aprova criação do Marco Regulatório da Inteligência Artificial no Brasil” </w:t>
@@ -652,10 +652,10 @@
         <w:rPr>
           <w:i/>
         </w:rPr>
-        <w:t xml:space="preserve">Copy sugerida: </w:t>
+        <w:t xml:space="preserve">Copy sugerida (gancho do curso, não repete a manchete): </w:t>
       </w:r>
       <w:r>
-        <w:t>“Comissão aprova criação do Marco Regulatório da Inteligência Artificial no Brasil. Sua Turma de Alto Nível 2026 estuda isso na semana 1.”</w:t>
+        <w:t>“Entenda tudo sobre o Marco Regulatório da IA, LGPD e ANPD na Turma de Alto Nível 2026 do PGDDDIA.”</w:t>
       </w:r>
     </w:p>
     <w:p>
@@ -763,7 +763,7 @@
         <w:rPr>
           <w:b/>
         </w:rPr>
-        <w:t xml:space="preserve">Manchete-base para a peça de notícia: </w:t>
+        <w:t xml:space="preserve">Manchete a estampar na peça (screenshot/citação): </w:t>
       </w:r>
       <w:r>
         <w:t xml:space="preserve">“Tendências de IA até 2026: Brasil avança em finanças, regulação e produtividade assistida” </w:t>
@@ -789,10 +789,10 @@
         <w:rPr>
           <w:i/>
         </w:rPr>
-        <w:t xml:space="preserve">Copy sugerida: </w:t>
+        <w:t xml:space="preserve">Copy sugerida (gancho do curso, não repete a manchete): </w:t>
       </w:r>
       <w:r>
-        <w:t>“Tendências de IA até 2026: Brasil avança em finanças, regulação e produtividade assistida. Sua Turma de Alto Nível 2026 estuda isso na semana 1.”</w:t>
+        <w:t>“Domine IA e Ciência de Dados aplicadas a finanças, regulação e produtividade na Turma de Alto Nível 2026 do MBADS.”</w:t>
       </w:r>
     </w:p>
     <w:p>
@@ -950,7 +950,7 @@
         <w:rPr>
           <w:b/>
         </w:rPr>
-        <w:t xml:space="preserve">Manchete-base para a peça de notícia: </w:t>
+        <w:t xml:space="preserve">Manchete a estampar na peça (screenshot/citação): </w:t>
       </w:r>
       <w:r>
         <w:t xml:space="preserve">“STF encerra audiência pública sobre vínculo empregatício em plataformas digitais” </w:t>
@@ -976,10 +976,10 @@
         <w:rPr>
           <w:i/>
         </w:rPr>
-        <w:t xml:space="preserve">Copy sugerida: </w:t>
+        <w:t xml:space="preserve">Copy sugerida (gancho do curso, não repete a manchete): </w:t>
       </w:r>
       <w:r>
-        <w:t>“STF encerra audiência pública sobre vínculo empregatício em plataformas digitais. Sua Turma de Alto Nível 2026 estuda isso na semana 1.”</w:t>
+        <w:t>“Entenda os novos vínculos de trabalho na economia de plataformas e pejotização na Turma de Alto Nível 2026 do PGDTRA.”</w:t>
       </w:r>
     </w:p>
     <w:p>
@@ -1152,7 +1152,7 @@
         <w:rPr>
           <w:b/>
         </w:rPr>
-        <w:t xml:space="preserve">Manchete-base para a peça de notícia: </w:t>
+        <w:t xml:space="preserve">Manchete a estampar na peça (screenshot/citação): </w:t>
       </w:r>
       <w:r>
         <w:t xml:space="preserve">“ANEEL homologa lotes do Leilão de Transmissão 1/2026 com investimentos de R$ 3,3 bilhões” </w:t>
@@ -1178,10 +1178,10 @@
         <w:rPr>
           <w:i/>
         </w:rPr>
-        <w:t xml:space="preserve">Copy sugerida: </w:t>
+        <w:t xml:space="preserve">Copy sugerida (gancho do curso, não repete a manchete): </w:t>
       </w:r>
       <w:r>
-        <w:t>“ANEEL homologa lotes do Leilão de Transmissão 1/2026 com investimentos de R$ 3,3 bilhões. Sua Turma de Alto Nível 2026 estuda isso na semana 1.”</w:t>
+        <w:t>“Domine leilões, regulação ANEEL e o novo desenho do setor elétrico na Turma de Alto Nível 2026 do MBADRSE.”</w:t>
       </w:r>
     </w:p>
     <w:p>
@@ -1354,7 +1354,7 @@
         <w:rPr>
           <w:b/>
         </w:rPr>
-        <w:t xml:space="preserve">Manchete-base para a peça de notícia: </w:t>
+        <w:t xml:space="preserve">Manchete a estampar na peça (screenshot/citação): </w:t>
       </w:r>
       <w:r>
         <w:t xml:space="preserve">“IA nas campanhas eleitorais 2026: veja o que TSE autoriza ou proíbe” </w:t>
@@ -1380,10 +1380,10 @@
         <w:rPr>
           <w:i/>
         </w:rPr>
-        <w:t xml:space="preserve">Copy sugerida: </w:t>
+        <w:t xml:space="preserve">Copy sugerida (gancho do curso, não repete a manchete): </w:t>
       </w:r>
       <w:r>
-        <w:t>“IA nas campanhas eleitorais 2026: veja o que TSE autoriza ou proíbe. Sua Turma de Alto Nível 2026 estuda isso na semana 1.”</w:t>
+        <w:t>“Domine as novas regras do TSE para IA, deepfake e propaganda digital na Turma de Alto Nível 2026 do PGMEC.”</w:t>
       </w:r>
     </w:p>
     <w:sectPr>

</xml_diff>